<commit_message>
build(db): introduce Alembic migrations (decision D6)
Baseline revision of the Stage 6 schema; startup now runs upgrade_to_head()
instead of create_all, stamping pre-Alembic databases at the baseline. A
new test fails if models and migrations ever disagree. E2E reset also
drops alembic_version. SDD section 33, build README and CHANGELOG updated.

Co-Authored-By: Claude Opus 5.5 <noreply@anthropic.com>
</commit_message>
<xml_diff>
--- a/Farm_Master_SDD_Stage6.docx
+++ b/Farm_Master_SDD_Stage6.docx
@@ -2234,6 +2234,59 @@
         <w:t>Images live on local disk (gitignored uploads/ directory), not cloud object storage -- fine for the pilot, not for a real multi-instance deployment.</w:t>
       </w:r>
     </w:p>
+    <w:p>
+      <w:pPr>
+        <w:pStyle w:val="Heading1"/>
+      </w:pPr>
+      <w:r>
+        <w:t>33. Schema Migrations With Alembic (11 October 2026)</w:t>
+      </w:r>
+    </w:p>
+    <w:p>
+      <w:r>
+        <w:t>Until this pass the schema was created by Base.metadata.create_all() at startup. That can add new tables, but it can never add a column or an enum value to an existing table, so every earlier schema change on an existing database relied on a dropped-and-recreated database. The CEO platform demo alignment adds columns to users, buyer_requirements and commitment_fee_payments, so Alembic was introduced (decision D6 in docs/ceo-demo-gap-report.md, flagged as a new dependency as the brief requires).</w:t>
+      </w:r>
+    </w:p>
+    <w:p>
+      <w:pPr>
+        <w:pStyle w:val="ListBullet"/>
+      </w:pPr>
+      <w:r>
+        <w:t>migrations/versions/0001_baseline is an autogenerated snapshot of the Stage 6 schema exactly as of commit f03fc41.</w:t>
+      </w:r>
+    </w:p>
+    <w:p>
+      <w:pPr>
+        <w:pStyle w:val="ListBullet"/>
+      </w:pPr>
+      <w:r>
+        <w:t>app/migrate.py runs at startup in place of create_all. If the database already has the users table but no alembic_version table (built by create_all before this change), it is stamped at 0001_baseline first, so only later revisions run.</w:t>
+      </w:r>
+    </w:p>
+    <w:p>
+      <w:pPr>
+        <w:pStyle w:val="ListBullet"/>
+      </w:pPr>
+      <w:r>
+        <w:t>alembic.ini carries no database URL. migrations/env.py always reads FARM_MASTER_DATABASE_URL via app.database, so a migration can never target a different database than the app.</w:t>
+      </w:r>
+    </w:p>
+    <w:p>
+      <w:pPr>
+        <w:pStyle w:val="ListBullet"/>
+      </w:pPr>
+      <w:r>
+        <w:t>tests/unit/test_migrations.py upgrades a scratch database to head and asserts Alembic's autogenerate comparator finds no difference from Base.metadata, so a model change without a revision fails the suite.</w:t>
+      </w:r>
+    </w:p>
+    <w:p>
+      <w:pPr>
+        <w:pStyle w:val="ListBullet"/>
+      </w:pPr>
+      <w:r>
+        <w:t>The E2E harness now also drops alembic_version when it resets farm_master_test, because drop_all only knows about mapped tables.</w:t>
+      </w:r>
+    </w:p>
     <w:sectPr>
       <w:pgSz w:w="12240" w:h="15840"/>
       <w:pgMar w:top="1440" w:right="1800" w:bottom="1440" w:left="1800" w:header="720" w:footer="720" w:gutter="0"/>

</xml_diff>

<commit_message>
feat(buyer): Buyer Portal page built to the CEO demo
/buyer: requirement form generated from /buyer/order-form (no hard-coded
crops, dates, prices or networks) with a live fee quote; the commitment-
fee modal (choose -> pending -> confirmed, sandbox phone simulator, retry
on failure); orders table with derived badges, progress and expandable
stepper rows. Adds FM.portal() bootstrap. Verified at 390/820/1400px and
clicked through end to end. SDD 36, README, CHANGELOG updated.

Co-Authored-By: Claude Opus 5.5 <noreply@anthropic.com>
</commit_message>
<xml_diff>
--- a/Farm_Master_SDD_Stage6.docx
+++ b/Farm_Master_SDD_Stage6.docx
@@ -2470,6 +2470,51 @@
         <w:t>Migration 0003_payments adds the enum value in an autocommit block, creates the sequence, and carries existing simulated payments over into the new provider/network columns.</w:t>
       </w:r>
     </w:p>
+    <w:p>
+      <w:pPr>
+        <w:pStyle w:val="Heading1"/>
+      </w:pPr>
+      <w:r>
+        <w:t>36. Buyer Portal Page, Built to the CEO Demo (11 October 2026)</w:t>
+      </w:r>
+    </w:p>
+    <w:p>
+      <w:r>
+        <w:t>frontend/portal_buyer.html, served at /buyer, is the first of the portal pages built to the CEO demo (decision D8: vanilla HTML/CSS/JS on the shared design system, no framework). It reuses FM.portal() from components.js for the top bar, role check, sign-in fallback and 'Signed in as' line from GET /auth/me.</w:t>
+      </w:r>
+    </w:p>
+    <w:p>
+      <w:pPr>
+        <w:pStyle w:val="ListBullet"/>
+      </w:pPr>
+      <w:r>
+        <w:t>Nothing on the form is hard-coded: crops/varieties, the earliest delivery date, the reference price and the payment options come from GET /buyer/order-form, and the fee line is a live GET /buyer/fee-quote with the rule's own explanation.</w:t>
+      </w:r>
+    </w:p>
+    <w:p>
+      <w:pPr>
+        <w:pStyle w:val="ListBullet"/>
+      </w:pPr>
+      <w:r>
+        <w:t>Submitting creates the requirement (pending_payment, FM-#### reference) and opens the modal: choose network (+ MoMo number) -&gt; pending (polls GET /buyer/payments/{id} every 1.5s; sandbox shows Approve/Decline on phone buttons; card shows the provider checkout link) -&gt; Payment confirmed -&gt; Done inserts the order at the top with its detail row open and shows the demo toast. A failed payment offers Try again; Cancel leaves the order saved with a Pay action in its detail row.</w:t>
+      </w:r>
+    </w:p>
+    <w:p>
+      <w:pPr>
+        <w:pStyle w:val="ListBullet"/>
+      </w:pPr>
+      <w:r>
+        <w:t>Orders table: reference, crop, quantity, a status badge and a progress bar, all derived server-side. Rows expand on click, Enter or Space to show the five-step stepper plus variety, delivery date, price, fee and spec notes.</w:t>
+      </w:r>
+    </w:p>
+    <w:p>
+      <w:pPr>
+        <w:pStyle w:val="ListBullet"/>
+      </w:pPr>
+      <w:r>
+        <w:t>Verified at 390 / 820 / 1400px with scripts/responsive_check.py (no horizontal scroll) and clicked through end to end against the dev database.</w:t>
+      </w:r>
+    </w:p>
     <w:sectPr>
       <w:pgSz w:w="12240" w:h="15840"/>
       <w:pgMar w:top="1440" w:right="1800" w:bottom="1440" w:left="1800" w:header="720" w:footer="720" w:gutter="0"/>

</xml_diff>

<commit_message>
feat(overview): public landing page built to the CEO demo
Hero, CTAs and How-it-works panel from the demo; ledger computed from
/api/public/stats; role-coloured portal cards; live ticker fed by the
anonymised /api/public/activity feed. Responsive at 390/820/1400px.
SDD 38, README, CHANGELOG.

Co-Authored-By: Claude Opus 5.5 <noreply@anthropic.com>
</commit_message>
<xml_diff>
--- a/Farm_Master_SDD_Stage6.docx
+++ b/Farm_Master_SDD_Stage6.docx
@@ -2563,6 +2563,19 @@
         <w:t>app/state.py holds one ALLOWED table per status enum (buyer order, dispatch job, trunking job, opportunity, input order). transition() raises a 409 for anything else, and payment confirmation, matching assignment, dispatch, delivery, trunking and intake now all go through it.</w:t>
       </w:r>
     </w:p>
+    <w:p>
+      <w:pPr>
+        <w:pStyle w:val="Heading1"/>
+      </w:pPr>
+      <w:r>
+        <w:t>38. Public Landing Page (11 October 2026)</w:t>
+      </w:r>
+    </w:p>
+    <w:p>
+      <w:r>
+        <w:t>frontend/portal_overview.html, served at /, rebuilds the demo's Overview screen. The hero copy and the four-step 'How it works' panel are taken from the demo. The ledger values (portals, fulfilment centres, revenue streams, head office) come from GET /api/public/stats, and the head-office town also fills the 'trunk them to ...' step. The portal cards link to /farmer, /buyer and /marketplace, each of which shows sign-in with a register link when signed out. The ticker uses FM.ticker on GET /api/public/activity: 5s rotation, 60s refresh, text swapped without fading under prefers-reduced-motion, and a neutral placeholder line until the fleet has produced events. Verified at 390/820/1400px.</w:t>
+      </w:r>
+    </w:p>
     <w:sectPr>
       <w:pgSz w:w="12240" w:h="15840"/>
       <w:pgMar w:top="1440" w:right="1800" w:bottom="1440" w:left="1800" w:header="720" w:footer="720" w:gutter="0"/>

</xml_diff>

<commit_message>
feat(farmer): Farmer Portal page built to the CEO demo
/farmer: matched-opportunity list with select highlight, detail panel
with stepper and formula checklist, Accept behind a one-step commitments
confirmation (D5) with the demo toast, and the ledger-backed wallet card.
Seed backfills crop/region on pre-existing opportunities. Responsive at
390/820/1400px. SDD 40, README, CHANGELOG.

Co-Authored-By: Claude Opus 5.5 <noreply@anthropic.com>
</commit_message>
<xml_diff>
--- a/Farm_Master_SDD_Stage6.docx
+++ b/Farm_Master_SDD_Stage6.docx
@@ -2632,6 +2632,19 @@
         <w:t>Migration 0005_farmer adds the two notificationtype values via ALTER TYPE (they can't be dropped on downgrade).</w:t>
       </w:r>
     </w:p>
+    <w:p>
+      <w:pPr>
+        <w:pStyle w:val="Heading1"/>
+      </w:pPr>
+      <w:r>
+        <w:t>40. Farmer Portal Page, Built to the CEO Demo (11 October 2026)</w:t>
+      </w:r>
+    </w:p>
+    <w:p>
+      <w:r>
+        <w:t>frontend/portal_farmer.html at /farmer: the demo's two-column layout (matched opportunities list and production-formula detail) above the Wallet &amp; settlement card. Rows are buttons in a listbox (keyboard accessible) showing the crop icon from the SVG set, '{crop} - {qty} tonnes', the buyer, the region and 'Delivery in N weeks' from the real delivery date. The detail panel shows grade, price and variety, the server-derived stepper and the formula checklist. Accept opens a one-step confirmation of the four existing commitments (decision D5) and then shows the demo's toast '{Crop} opportunity accepted - agronomist will contact you within 48 hours.' The wallet card reads GET /farmer/wallet/summary. Links lead to the marketplace, harvest pickup, milestones/messaging and the full statement. Verified at 390/820/1400px and through a scripted accept in headless Chromium.</w:t>
+      </w:r>
+    </w:p>
     <w:sectPr>
       <w:pgSz w:w="12240" w:h="15840"/>
       <w:pgMar w:top="1440" w:right="1800" w:bottom="1440" w:left="1800" w:header="720" w:footer="720" w:gutter="0"/>

</xml_diff>

<commit_message>
feat(marketplace): Marketplace page built to the CEO demo
/marketplace (the demo's Vendor Portal tab): API-driven category tabs,
product cards with vendor, icon/photo and stock, add-to-order toast, and a
sticky per-vendor cart with qty stepper, remove and needed-on dates for
equipment/services; Place order shows the SLA toast. Verified at
390/820/1400px and via a scripted two-vendor checkout. SDD 42, README,
CHANGELOG.

Co-Authored-By: Claude Opus 5.5 <noreply@anthropic.com>
</commit_message>
<xml_diff>
--- a/Farm_Master_SDD_Stage6.docx
+++ b/Farm_Master_SDD_Stage6.docx
@@ -2701,6 +2701,19 @@
         <w:t>Logistics events describe marketplace deliveries generically (category name, 'rented equipment', 'a service crew') so the public feed stays anonymised.</w:t>
       </w:r>
     </w:p>
+    <w:p>
+      <w:pPr>
+        <w:pStyle w:val="Heading1"/>
+      </w:pPr>
+      <w:r>
+        <w:t>42. Marketplace Page, Built to the CEO Demo (11 October 2026)</w:t>
+      </w:r>
+    </w:p>
+    <w:p>
+      <w:r>
+        <w:t>frontend/portal_marketplace.html at /marketplace is the demo's 'Vendor Portal' tab, which brief 2E treats as the farmer-facing marketplace, so it requires a farmer sign-in. The vendor's own back-office stays at /vendor-dashboard-flow and is linked from the page. Tabs come from the API. Cards show the title, vendor (marked when Farm Master-owned), price + unit, stock where tracked, and a photo or the stroke icon. The cart improves on the demo with a +/- qty stepper, grouping by vendor when the cart spans several, and a 'Needed on' date for equipment and services (validated again server-side). It persists in this browser's localStorage only until Place order. Placing the order shows the server's message ('Order routed to Farm Master logistics - estimated farm-gate delivery in {N} days.'), clears the cart and reloads stock. Verified at 390/820/1400px and through a scripted two-vendor order in headless Chromium.</w:t>
+      </w:r>
+    </w:p>
     <w:sectPr>
       <w:pgSz w:w="12240" w:h="15840"/>
       <w:pgMar w:top="1440" w:right="1800" w:bottom="1440" w:left="1800" w:header="720" w:footer="720" w:gutter="0"/>

</xml_diff>

<commit_message>
test(e2e): portal suite for every demo interaction; fix touch targets
New tests/e2e/test_ceo_demo_portals_e2e.py drives the brief's section 9
interactions against a live server and checks overflow + 44px touch
targets at 375/768/1280px. It found and this fixes: compact demo controls
under PRD 5.1's 44px minimum (44px hit areas in components.css, check-row
checkboxes), a startup crash on fresh databases under cp1252 consoles
(non-ASCII seed log line), and the marketplace Place order handler lost
after in-page sign-in. Design-system rule 6, SDD 44, CHANGELOG.

Co-Authored-By: Claude Opus 5.5 <noreply@anthropic.com>
</commit_message>
<xml_diff>
--- a/Farm_Master_SDD_Stage6.docx
+++ b/Farm_Master_SDD_Stage6.docx
@@ -2727,6 +2727,19 @@
         <w:t>This completes decision D1. migrate_products_to_listings() (run by the seed, idempotent) copies every product into an ACTIVE listing (kind input; category, formula input type and stock carried over; unit rendered as 'per {unit}'), records the link on products.listing_id (migration 0007) and zeroes the product's stock, so stock lives in one place. Historic input_order_lines keep their product_id. The Order Inputs screen's real value, pre-filling quantities from the production formula, moved to GET /farmer/marketplace/formula-prefill and a banner on /marketplace (auto-applied when arriving from the old /order-inputs-flow URL). Marketplace orders carry production_formula_id, so Order Reconciliation and the farmer wallet still attribute input costs to the right buyer order. The retired write endpoints return 410 rather than disappearing, so any old client gets a clear pointer.</w:t>
       </w:r>
     </w:p>
+    <w:p>
+      <w:pPr>
+        <w:pStyle w:val="Heading1"/>
+      </w:pPr>
+      <w:r>
+        <w:t>44. Portal E2E Suite and Touch-Target Fixes (11 October 2026)</w:t>
+      </w:r>
+    </w:p>
+    <w:p>
+      <w:r>
+        <w:t>tests/e2e/test_ceo_demo_portals_e2e.py drives every interaction in the brief's section 9 checklist against a live uvicorn + Playwright server on a freshly migrated and seeded farm_master_test: portal switching and landing CTAs; buyer submit -&gt; payment modal -&gt; sandbox approval -&gt; success -&gt; new order row expanded, then collapse and expand; farmer select and accept with commitments, the exact toast and wallet change; marketplace tabs, add, remove, qty stepper and place order with the exact toast. Each portal is also checked at 375/768/1280px for horizontal overflow and the existing 44px touch-target rule. The suite found three real defects, all fixed: compact demo controls below 44px (now with 44px hit areas in components.css), a startup crash on a fresh database under a cp1252 Windows console (a seed print containing the cedi sign), and the marketplace Place order handler being lost after in-page sign-in.</w:t>
+      </w:r>
+    </w:p>
     <w:sectPr>
       <w:pgSz w:w="12240" w:h="15840"/>
       <w:pgMar w:top="1440" w:right="1800" w:bottom="1440" w:left="1800" w:header="720" w:footer="720" w:gutter="0"/>

</xml_diff>

<commit_message>
docs: shareable static preview, implementation status, run instructions
Adds scripts/build_static_demo.py (+ static_demo mock/patch) that builds a
backend-free preview of the four portal pages from a snapshot of the
running app, published as a private shareable link. Gap report gains an
implementation-status section (finished / in progress / open questions);
root and build READMEs gain run instructions, demo accounts and the
preview link; SDD 45; schema doc regenerated; CHANGELOG.

Co-Authored-By: Claude Opus 5.5 <noreply@anthropic.com>
</commit_message>
<xml_diff>
--- a/Farm_Master_SDD_Stage6.docx
+++ b/Farm_Master_SDD_Stage6.docx
@@ -2740,6 +2740,19 @@
         <w:t>tests/e2e/test_ceo_demo_portals_e2e.py drives every interaction in the brief's section 9 checklist against a live uvicorn + Playwright server on a freshly migrated and seeded farm_master_test: portal switching and landing CTAs; buyer submit -&gt; payment modal -&gt; sandbox approval -&gt; success -&gt; new order row expanded, then collapse and expand; farmer select and accept with commitments, the exact toast and wallet change; marketplace tabs, add, remove, qty stepper and place order with the exact toast. Each portal is also checked at 375/768/1280px for horizontal overflow and the existing 44px touch-target rule. The suite found three real defects, all fixed: compact demo controls below 44px (now with 44px hit areas in components.css), a startup crash on a fresh database under a cp1252 Windows console (a seed print containing the cedi sign), and the marketplace Place order handler being lost after in-page sign-in.</w:t>
       </w:r>
     </w:p>
+    <w:p>
+      <w:pPr>
+        <w:pStyle w:val="Heading1"/>
+      </w:pPr>
+      <w:r>
+        <w:t>45. Static Shareable Preview and Status (11 October 2026)</w:t>
+      </w:r>
+    </w:p>
+    <w:p>
+      <w:r>
+        <w:t>The full app needs PostgreSQL and a Python server, so it can't run on a free static host. scripts/build_static_demo.py produces a separate preview: it signs in to a running app as the demo accounts, captures the exact JSON the four portal pages read, rewrites their links to static files, and adds scripts/static_demo/mock-api.js. The mock answers the same fetch calls from that snapshot and simulates the actions (requirement + sandbox payment, opportunity acceptance with the wallet change, marketplace order) in memory. A banner states that no payments are real and nothing is saved, and links to screens outside the preview show a toast instead of a broken page. It is published at https://claude.ai/artifact/VJ3eaUesdjfFBKRhtPQvQX (private until shared). It's a sales preview, not the system of record. Implementation status and open questions are kept in docs/ceo-demo-gap-report.md.</w:t>
+      </w:r>
+    </w:p>
     <w:sectPr>
       <w:pgSz w:w="12240" w:h="15840"/>
       <w:pgMar w:top="1440" w:right="1800" w:bottom="1440" w:left="1800" w:header="720" w:footer="720" w:gutter="0"/>

</xml_diff>

<commit_message>
docs: Preview via Cloudflare (README, Stage 6 README, SDD section 46)
Co-Authored-By: Claude Opus 5.5 <noreply@anthropic.com>
</commit_message>
<xml_diff>
--- a/Farm_Master_SDD_Stage6.docx
+++ b/Farm_Master_SDD_Stage6.docx
@@ -2753,6 +2753,44 @@
         <w:t>The full app needs PostgreSQL and a Python server, so it can't run on a free static host. scripts/build_static_demo.py produces a separate preview: it signs in to a running app as the demo accounts, captures the exact JSON the four portal pages read, rewrites their links to static files, and adds scripts/static_demo/mock-api.js. The mock answers the same fetch calls from that snapshot and simulates the actions (requirement + sandbox payment, opportunity acceptance with the wallet change, marketplace order) in memory. A banner states that no payments are real and nothing is saved, and links to screens outside the preview show a toast instead of a broken page. It is published at https://claude.ai/artifact/VJ3eaUesdjfFBKRhtPQvQX (private until shared). It's a sales preview, not the system of record. Implementation status and open questions are kept in docs/ceo-demo-gap-report.md.</w:t>
       </w:r>
     </w:p>
+    <w:p>
+      <w:pPr>
+        <w:pStyle w:val="Heading1"/>
+      </w:pPr>
+      <w:r>
+        <w:t>46. Public Preview via Cloudflare Quick Tunnel (13 October 2026)</w:t>
+      </w:r>
+    </w:p>
+    <w:p>
+      <w:r>
+        <w:t>Purpose: a working public HTTPS link to the live app for phones and remote reviewers, with no Cloudflare account. The portals and API are already one origin (FastAPI serves frontend/ under /static and every portal route), so one tunnel to 127.0.0.1:8000 carries everything, with no CORS or hard-coded localhost URLs to rewrite.</w:t>
+      </w:r>
+    </w:p>
+    <w:p>
+      <w:r>
+        <w:t>Runtime: Stage 6 Build/start-preview.ps1 (with a start-preview.sh wrapper) stops any earlier run, starts PostgreSQL if needed, runs scripts/preview_accounts.py, then starts uvicorn on 127.0.0.1:8000 (no reload, proxy headers trusted only from 127.0.0.1) and cloudflared tunnel --url. Both run as detached processes created through WMI, so they outlive the starting shell. -Install registers a FarmMasterPreview Windows sign-in task. Runtime state (JWT secret, rotated logins, logs, the current link) is in the git-ignored .preview/ folder.</w:t>
+      </w:r>
+    </w:p>
+    <w:p>
+      <w:r>
+        <w:t>Security model (app/preview.py, FARM_MASTER_PUBLIC_PREVIEW=1): /docs, /redoc and /openapi.json are disabled. CORS allows no cross-origin callers unless FARM_MASTER_CORS_ORIGINS lists them. At startup, after migrations and seeding, the app refuses to run if the JWT secret is the dev default or shorter than 32 characters, or if any active account's password matches a known weak value (password123, password, admin123). preview_accounts.py gives each such account a random 16-character password and keeps it across restarts. Sign-in and RBAC are unchanged: every portal still requires password + one-time code, and every data endpoint checks the role.</w:t>
+      </w:r>
+    </w:p>
+    <w:p>
+      <w:r>
+        <w:t>Frontend changes: the 23 *-flow pages no longer pre-fill password123, and the vendor flow's “simulate Super Admin approval” shortcut prompts for the admin password instead of embedding it.</w:t>
+      </w:r>
+    </w:p>
+    <w:p>
+      <w:r>
+        <w:t>Database exposure: pg_hba.conf only accepts 127.0.0.1/::1, and listen_addresses on the local PostgreSQL 17 instance was changed from '*' to 'localhost' (this takes effect when the service next restarts). The tunnel only forwards port 8000. There are no schema changes in this section, so docs/database-schema.md is unchanged.</w:t>
+      </w:r>
+    </w:p>
+    <w:p>
+      <w:r>
+        <w:t>Known limitation: the one-time code is still returned to the browser because email/SMS delivery isn't integrated yet (PRD Section 12), so on the public link the strong password is the only real login factor. Quick Tunnel links change on every restart. A permanent link needs a Cloudflare account, the farmmaster.com.gh DNS zone on Cloudflare, and a named tunnel (optionally behind Cloudflare Access).</w:t>
+      </w:r>
+    </w:p>
     <w:sectPr>
       <w:pgSz w:w="12240" w:h="15840"/>
       <w:pgMar w:top="1440" w:right="1800" w:bottom="1440" w:left="1800" w:header="720" w:footer="720" w:gutter="0"/>

</xml_diff>

<commit_message>
feat(preview): one-click sign-in on every portal of the public preview
At the owner's request, FARM_MASTER_DEMO_PREFILL=1 (set by the preview
launcher) injects the local .preview/credentials.txt logins into each served
page; login forms arrive filled and the on-screen OTP step continues
automatically, Super Admin included. No passwords are committed.
start-preview --app-only restarts the API and keeps the tunnel link; /static
assets now revalidate so devices don't run a stale components.js.
Docs: README, CHANGELOG, SDD section 46.

Co-Authored-By: Claude Opus 5.5 <noreply@anthropic.com>
</commit_message>
<xml_diff>
--- a/Farm_Master_SDD_Stage6.docx
+++ b/Farm_Master_SDD_Stage6.docx
@@ -2791,6 +2791,11 @@
         <w:t>Known limitation: the one-time code is still returned to the browser because email/SMS delivery isn't integrated yet (PRD Section 12), so on the public link the strong password is the only real login factor. Quick Tunnel links change on every restart. A permanent link needs a Cloudflare account, the farmmaster.com.gh DNS zone on Cloudflare, and a named tunnel (optionally behind Cloudflare Access).</w:t>
       </w:r>
     </w:p>
+    <w:p>
+      <w:r>
+        <w:t>One-click sign-in (added 13 October 2026, at the owner's request): with FARM_MASTER_DEMO_PREFILL=1, which the preview launcher sets, _flow_page injects window.FM_DEMO_LOGINS (read from the git-ignored .preview/credentials.txt on each request) before the page's first script. It also injects a small observer that presses the pre-filled #otpBtn once, at most every 3 seconds. Flow pages read their default account's password from it, and FM.signIn pre-fills the password and auto-submits the on-screen code. Every portal, Super Admin included, is therefore one click for anyone holding the link; RBAC on the endpoints is unchanged. /static responses now carry Cache-Control: no-cache so devices pick up asset changes. start-preview -AppOnly restarts the API without changing the tunnel link.</w:t>
+      </w:r>
+    </w:p>
     <w:sectPr>
       <w:pgSz w:w="12240" w:h="15840"/>
       <w:pgMar w:top="1440" w:right="1800" w:bottom="1440" w:left="1800" w:header="720" w:footer="720" w:gutter="0"/>

</xml_diff>

<commit_message>
feat(feedback): stakeholder feedback box on every page
Every served page gets a Feedback button (assets/feedback.js). POST /api/feedback (no sign-in, rate-limited) stores it in the new feedback table (migration 0008); Super Admin reads it at /feedback or as CSV. Also the optional FARM_MASTER_PROXY_SECRET check for the permanent link. Docs: README, CHANGELOG, SDD sections 46-47, database-schema.md.

Co-Authored-By: Claude Opus 5.5 <noreply@anthropic.com>
</commit_message>
<xml_diff>
--- a/Farm_Master_SDD_Stage6.docx
+++ b/Farm_Master_SDD_Stage6.docx
@@ -2796,6 +2796,34 @@
         <w:t>One-click sign-in (added 13 October 2026, at the owner's request): with FARM_MASTER_DEMO_PREFILL=1, which the preview launcher sets, _flow_page injects window.FM_DEMO_LOGINS (read from the git-ignored .preview/credentials.txt on each request) before the page's first script. It also injects a small observer that presses the pre-filled #otpBtn once, at most every 3 seconds. Flow pages read their default account's password from it, and FM.signIn pre-fills the password and auto-submits the on-screen code. Every portal, Super Admin included, is therefore one click for anyone holding the link; RBAC on the endpoints is unchanged. /static responses now carry Cache-Control: no-cache so devices pick up asset changes. start-preview -AppOnly restarts the API without changing the tunnel link.</w:t>
       </w:r>
     </w:p>
+    <w:p>
+      <w:r>
+        <w:t>Permanent link (13 October 2026): https://farm-master.doeemmanuel07.workers.dev is a Cloudflare Worker (preview-worker/) on the free plan. It reads the current Quick Tunnel address from Workers KV (key tunnel_url) and forwards each request there, with no-follow redirects and absolute redirect Locations rewritten to the Worker's own address. start-preview writes the key whenever a new tunnel starts and deletes it on -Stop, so the Worker then returns a 503 'offline' page. At the owner's request the link is open to anyone who has it, with one-click sign-in. A Cloudflare Zero Trust (free) organisation exists, so the Worker can be put behind Access later. The app also supports FARM_MASTER_PROXY_SECRET: when it is set together with the Worker's PROXY_SECRET, requests arriving through Cloudflare without the secret get a 403. It is currently unset.</w:t>
+      </w:r>
+    </w:p>
+    <w:p>
+      <w:pPr>
+        <w:pStyle w:val="Heading1"/>
+      </w:pPr>
+      <w:r>
+        <w:t>47. Stakeholder Feedback on Every Page (13 October 2026)</w:t>
+      </w:r>
+    </w:p>
+    <w:p>
+      <w:r>
+        <w:t>Purpose: let stakeholders reviewing the public preview leave recommendations in place, on the page they are looking at. _flow_page appends assets/feedback.js to every HTML page it serves (Overview, the four portals, all *-flow screens, /feedback). The script is self-contained (the flow pages don't load components.js) and shows a 44px floating Feedback button with an accessible dialog: type (suggestion, problem, question, praise), message (3 to 2000 characters) and an optional name, remembered per browser.</w:t>
+      </w:r>
+    </w:p>
+    <w:p>
+      <w:r>
+        <w:t>API and data: POST /api/feedback is unauthenticated, so anyone with the link can comment. If the farmmaster_session token is valid, the author's user id and role are recorded. The portal is derived server-side from the page path, and posts are limited to 30 per hour per client address (CF-Connecting-IP when proxied). GET /api/feedback and GET /api/feedback/export.csv are Super Admin only, and /feedback is the inbox page (portal filter, CSV download). New table feedback (id, portal, page, category, message, name, user_id FK users, user_role, created_at), migration 0008_feedback; docs/database-schema.md regenerated.</w:t>
+      </w:r>
+    </w:p>
+    <w:p>
+      <w:r>
+        <w:t>Verified: tests/api/test_feedback.py (11 tests: anonymous and signed-in posts, validation, portal mapping, RBAC on read/export, rate limit, button present on every page); the CEO demo portal e2e suite still passes (8) with the button in place; manual check on the permanent link and locally (post, then read in /feedback).</w:t>
+      </w:r>
+    </w:p>
     <w:sectPr>
       <w:pgSz w:w="12240" w:h="15840"/>
       <w:pgMar w:top="1440" w:right="1800" w:bottom="1440" w:left="1800" w:header="720" w:footer="720" w:gutter="0"/>

</xml_diff>